<commit_message>
steak to side notes
</commit_message>
<xml_diff>
--- a/Bowdies-Training-Reference-Pitch-v2.docx
+++ b/Bowdies-Training-Reference-Pitch-v2.docx
@@ -231,43 +231,43 @@
           <w:sz w:val="22"/>
           <w:szCs w:val="22"/>
         </w:rPr>
-        <w:t xml:space="preserve">It also functions as a </w:t>
-      </w:r>
-      <w:r>
-        <w:rPr>
-          <w:rFonts w:ascii="Times New Roman" w:cs="Times New Roman" w:eastAsia="Times New Roman" w:hAnsi="Times New Roman"/>
-          <w:b/>
-          <w:bCs/>
-          <w:sz w:val="22"/>
-          <w:szCs w:val="22"/>
-        </w:rPr>
-        <w:t xml:space="preserve">working recipe reference.</w:t>
-      </w:r>
-      <w:r>
-        <w:rPr>
-          <w:rFonts w:ascii="Times New Roman" w:cs="Times New Roman" w:eastAsia="Times New Roman" w:hAnsi="Times New Roman"/>
-          <w:sz w:val="22"/>
-          <w:szCs w:val="22"/>
-        </w:rPr>
-        <w:t xml:space="preserve"> Every cocktail on the program has its ingredient list and build instructions; every plated item has prep directions </w:t>
-      </w:r>
-      <w:r>
-        <w:rPr>
-          <w:rFonts w:ascii="Times New Roman" w:cs="Times New Roman" w:eastAsia="Times New Roman" w:hAnsi="Times New Roman"/>
-          <w:b/>
-          <w:bCs/>
-          <w:sz w:val="22"/>
-          <w:szCs w:val="22"/>
-        </w:rPr>
-        <w:t xml:space="preserve">and allergens.</w:t>
-      </w:r>
-      <w:r>
-        <w:rPr>
-          <w:rFonts w:ascii="Times New Roman" w:cs="Times New Roman" w:eastAsia="Times New Roman" w:hAnsi="Times New Roman"/>
-          <w:sz w:val="22"/>
-          <w:szCs w:val="22"/>
-        </w:rPr>
-        <w:t xml:space="preserve"> A new bartender doesn’t guess — they look up the spec. A prep cook doesn’t flip through pages of written recipes just to find one. The same document that teaches pairing also holds the build.</w:t>
+        <w:t xml:space="preserve">It also functions as both a </w:t>
+      </w:r>
+      <w:r>
+        <w:rPr>
+          <w:rFonts w:ascii="Times New Roman" w:cs="Times New Roman" w:eastAsia="Times New Roman" w:hAnsi="Times New Roman"/>
+          <w:b/>
+          <w:bCs/>
+          <w:sz w:val="22"/>
+          <w:szCs w:val="22"/>
+        </w:rPr>
+        <w:t xml:space="preserve">working recipe reference</w:t>
+      </w:r>
+      <w:r>
+        <w:rPr>
+          <w:rFonts w:ascii="Times New Roman" w:cs="Times New Roman" w:eastAsia="Times New Roman" w:hAnsi="Times New Roman"/>
+          <w:sz w:val="22"/>
+          <w:szCs w:val="22"/>
+        </w:rPr>
+        <w:t xml:space="preserve"> and a </w:t>
+      </w:r>
+      <w:r>
+        <w:rPr>
+          <w:rFonts w:ascii="Times New Roman" w:cs="Times New Roman" w:eastAsia="Times New Roman" w:hAnsi="Times New Roman"/>
+          <w:b/>
+          <w:bCs/>
+          <w:sz w:val="22"/>
+          <w:szCs w:val="22"/>
+        </w:rPr>
+        <w:t xml:space="preserve">tasting/sales notes reference.</w:t>
+      </w:r>
+      <w:r>
+        <w:rPr>
+          <w:rFonts w:ascii="Times New Roman" w:cs="Times New Roman" w:eastAsia="Times New Roman" w:hAnsi="Times New Roman"/>
+          <w:sz w:val="22"/>
+          <w:szCs w:val="22"/>
+        </w:rPr>
+        <w:t xml:space="preserve"> Every cocktail on the program has its ingredient list, build instructions, and sell-it notes; every plated item has prep directions and allergens. A new bartender doesn’t guess — they look up the spec. A prep cook doesn’t flip through pages of written recipes just to find one. The same document that teaches pairing also holds the build.</w:t>
       </w:r>
     </w:p>
     <w:p>

</xml_diff>